<commit_message>
Project proposal shrinked to 5 pages (without references)
</commit_message>
<xml_diff>
--- a/docs_for_guenther/Project_Timeline_2027-2028_en.docx
+++ b/docs_for_guenther/Project_Timeline_2027-2028_en.docx
@@ -98,9 +98,9 @@
         <w:gridCol w:w="1362"/>
         <w:gridCol w:w="1361"/>
         <w:gridCol w:w="1362"/>
+        <w:gridCol w:w="1363"/>
         <w:gridCol w:w="1361"/>
-        <w:gridCol w:w="1361"/>
-        <w:gridCol w:w="1358"/>
+        <w:gridCol w:w="1356"/>
       </w:tblGrid>
       <w:tr>
         <w:trPr/>
@@ -418,7 +418,7 @@
         </w:tc>
         <w:tc>
           <w:tcPr>
-            <w:tcW w:w="1361" w:type="dxa"/>
+            <w:tcW w:w="1363" w:type="dxa"/>
             <w:tcBorders/>
             <w:vAlign w:val="center"/>
           </w:tcPr>
@@ -496,7 +496,7 @@
         </w:tc>
         <w:tc>
           <w:tcPr>
-            <w:tcW w:w="1358" w:type="dxa"/>
+            <w:tcW w:w="1356" w:type="dxa"/>
             <w:tcBorders/>
             <w:vAlign w:val="center"/>
           </w:tcPr>
@@ -847,7 +847,7 @@
         </w:tc>
         <w:tc>
           <w:tcPr>
-            <w:tcW w:w="1361" w:type="dxa"/>
+            <w:tcW w:w="1363" w:type="dxa"/>
             <w:tcBorders>
               <w:top w:val="nil"/>
               <w:bottom w:val="nil"/>
@@ -919,7 +919,7 @@
         </w:tc>
         <w:tc>
           <w:tcPr>
-            <w:tcW w:w="1358" w:type="dxa"/>
+            <w:tcW w:w="1356" w:type="dxa"/>
             <w:tcBorders>
               <w:top w:val="nil"/>
               <w:bottom w:val="nil"/>
@@ -1249,7 +1249,7 @@
         </w:tc>
         <w:tc>
           <w:tcPr>
-            <w:tcW w:w="1361" w:type="dxa"/>
+            <w:tcW w:w="1363" w:type="dxa"/>
             <w:tcBorders>
               <w:top w:val="nil"/>
               <w:bottom w:val="nil"/>
@@ -1321,7 +1321,7 @@
         </w:tc>
         <w:tc>
           <w:tcPr>
-            <w:tcW w:w="1358" w:type="dxa"/>
+            <w:tcW w:w="1356" w:type="dxa"/>
             <w:tcBorders>
               <w:top w:val="nil"/>
               <w:bottom w:val="nil"/>
@@ -1614,7 +1614,13 @@
               </w:rPr>
             </w:pPr>
             <w:r>
-              <w:rPr/>
+              <w:rPr>
+                <w:rFonts w:eastAsia="ＭＳ 明朝" w:cs=""/>
+                <w:color w:val="365F91"/>
+                <w:kern w:val="0"/>
+                <w:szCs w:val="22"/>
+                <w:lang w:val="en-US" w:eastAsia="en-US" w:bidi="ar-SA"/>
+              </w:rPr>
             </w:r>
           </w:p>
         </w:tc>
@@ -1644,7 +1650,49 @@
               </w:rPr>
             </w:pPr>
             <w:r>
-              <w:rPr/>
+              <w:rPr>
+                <w:rFonts w:eastAsia="ＭＳ 明朝" w:cs=""/>
+                <w:color w:val="365F91"/>
+                <w:kern w:val="0"/>
+                <w:szCs w:val="22"/>
+                <w:lang w:val="en-US" w:eastAsia="en-US" w:bidi="ar-SA"/>
+              </w:rPr>
+            </w:r>
+          </w:p>
+        </w:tc>
+        <w:tc>
+          <w:tcPr>
+            <w:tcW w:w="1363" w:type="dxa"/>
+            <w:tcBorders>
+              <w:top w:val="nil"/>
+              <w:bottom w:val="nil"/>
+            </w:tcBorders>
+            <w:shd w:color="auto" w:fill="D3DFEE" w:themeFill="accent1" w:themeFillTint="3f" w:val="clear"/>
+            <w:vAlign w:val="center"/>
+          </w:tcPr>
+          <w:p>
+            <w:pPr>
+              <w:pStyle w:val="Normal"/>
+              <w:widowControl w:val="false"/>
+              <w:suppressAutoHyphens w:val="true"/>
+              <w:spacing w:lineRule="auto" w:line="240" w:before="0" w:after="0"/>
+              <w:jc w:val="left"/>
+              <w:rPr>
+                <w:rFonts w:eastAsia="ＭＳ 明朝" w:cs=""/>
+                <w:color w:val="365F91"/>
+                <w:kern w:val="0"/>
+                <w:szCs w:val="22"/>
+                <w:lang w:val="en-US" w:eastAsia="en-US" w:bidi="ar-SA"/>
+              </w:rPr>
+            </w:pPr>
+            <w:r>
+              <w:rPr>
+                <w:rFonts w:eastAsia="ＭＳ 明朝" w:cs=""/>
+                <w:color w:val="365F91"/>
+                <w:kern w:val="0"/>
+                <w:szCs w:val="22"/>
+                <w:lang w:val="en-US" w:eastAsia="en-US" w:bidi="ar-SA"/>
+              </w:rPr>
             </w:r>
           </w:p>
         </w:tc>
@@ -1674,49 +1722,19 @@
               </w:rPr>
             </w:pPr>
             <w:r>
-              <w:rPr/>
+              <w:rPr>
+                <w:rFonts w:eastAsia="ＭＳ 明朝" w:cs=""/>
+                <w:color w:val="365F91"/>
+                <w:kern w:val="0"/>
+                <w:szCs w:val="22"/>
+                <w:lang w:val="en-US" w:eastAsia="en-US" w:bidi="ar-SA"/>
+              </w:rPr>
             </w:r>
           </w:p>
         </w:tc>
         <w:tc>
           <w:tcPr>
-            <w:tcW w:w="1361" w:type="dxa"/>
-            <w:tcBorders>
-              <w:top w:val="nil"/>
-              <w:bottom w:val="nil"/>
-            </w:tcBorders>
-            <w:shd w:color="auto" w:fill="D3DFEE" w:themeFill="accent1" w:themeFillTint="3f" w:val="clear"/>
-            <w:vAlign w:val="center"/>
-          </w:tcPr>
-          <w:p>
-            <w:pPr>
-              <w:pStyle w:val="Normal"/>
-              <w:widowControl w:val="false"/>
-              <w:suppressAutoHyphens w:val="true"/>
-              <w:spacing w:lineRule="auto" w:line="240" w:before="0" w:after="0"/>
-              <w:jc w:val="left"/>
-              <w:rPr>
-                <w:rFonts w:eastAsia="ＭＳ 明朝" w:cs=""/>
-                <w:color w:val="365F91"/>
-                <w:kern w:val="0"/>
-                <w:szCs w:val="22"/>
-                <w:lang w:val="en-US" w:eastAsia="en-US" w:bidi="ar-SA"/>
-              </w:rPr>
-            </w:pPr>
-            <w:r>
-              <w:rPr>
-                <w:rFonts w:eastAsia="ＭＳ 明朝" w:cs=""/>
-                <w:color w:val="365F91"/>
-                <w:kern w:val="0"/>
-                <w:szCs w:val="22"/>
-                <w:lang w:val="en-US" w:eastAsia="en-US" w:bidi="ar-SA"/>
-              </w:rPr>
-            </w:r>
-          </w:p>
-        </w:tc>
-        <w:tc>
-          <w:tcPr>
-            <w:tcW w:w="1358" w:type="dxa"/>
+            <w:tcW w:w="1356" w:type="dxa"/>
             <w:tcBorders>
               <w:top w:val="nil"/>
               <w:bottom w:val="nil"/>
@@ -2038,7 +2056,7 @@
         </w:tc>
         <w:tc>
           <w:tcPr>
-            <w:tcW w:w="1361" w:type="dxa"/>
+            <w:tcW w:w="1363" w:type="dxa"/>
             <w:tcBorders>
               <w:top w:val="nil"/>
               <w:bottom w:val="nil"/>
@@ -2092,7 +2110,7 @@
         </w:tc>
         <w:tc>
           <w:tcPr>
-            <w:tcW w:w="1358" w:type="dxa"/>
+            <w:tcW w:w="1356" w:type="dxa"/>
             <w:tcBorders>
               <w:top w:val="nil"/>
               <w:bottom w:val="nil"/>
@@ -2265,7 +2283,13 @@
               </w:rPr>
             </w:pPr>
             <w:r>
-              <w:rPr/>
+              <w:rPr>
+                <w:rFonts w:eastAsia="ＭＳ 明朝" w:cs=""/>
+                <w:color w:val="365F91"/>
+                <w:kern w:val="0"/>
+                <w:szCs w:val="22"/>
+                <w:lang w:val="en-US" w:eastAsia="en-US" w:bidi="ar-SA"/>
+              </w:rPr>
             </w:r>
           </w:p>
         </w:tc>
@@ -2413,7 +2437,7 @@
         </w:tc>
         <w:tc>
           <w:tcPr>
-            <w:tcW w:w="1361" w:type="dxa"/>
+            <w:tcW w:w="1363" w:type="dxa"/>
             <w:tcBorders>
               <w:top w:val="nil"/>
               <w:bottom w:val="nil"/>
@@ -2479,7 +2503,7 @@
         </w:tc>
         <w:tc>
           <w:tcPr>
-            <w:tcW w:w="1358" w:type="dxa"/>
+            <w:tcW w:w="1356" w:type="dxa"/>
             <w:tcBorders>
               <w:top w:val="nil"/>
               <w:bottom w:val="nil"/>
@@ -2817,7 +2841,7 @@
         </w:tc>
         <w:tc>
           <w:tcPr>
-            <w:tcW w:w="1361" w:type="dxa"/>
+            <w:tcW w:w="1363" w:type="dxa"/>
             <w:tcBorders>
               <w:top w:val="nil"/>
               <w:bottom w:val="nil"/>
@@ -2891,7 +2915,7 @@
         </w:tc>
         <w:tc>
           <w:tcPr>
-            <w:tcW w:w="1358" w:type="dxa"/>
+            <w:tcW w:w="1356" w:type="dxa"/>
             <w:tcBorders>
               <w:top w:val="nil"/>
               <w:bottom w:val="nil"/>
@@ -3206,7 +3230,7 @@
         </w:tc>
         <w:tc>
           <w:tcPr>
-            <w:tcW w:w="1361" w:type="dxa"/>
+            <w:tcW w:w="1363" w:type="dxa"/>
             <w:tcBorders>
               <w:top w:val="nil"/>
             </w:tcBorders>
@@ -3270,7 +3294,7 @@
         </w:tc>
         <w:tc>
           <w:tcPr>
-            <w:tcW w:w="1358" w:type="dxa"/>
+            <w:tcW w:w="1356" w:type="dxa"/>
             <w:tcBorders>
               <w:top w:val="nil"/>
             </w:tcBorders>
@@ -4186,15 +4210,7 @@
       </w:pPr>
       <w:r>
         <w:rPr/>
-        <w:t xml:space="preserve">The following table </w:t>
-      </w:r>
-      <w:r>
-        <w:rPr/>
-        <w:t>presents</w:t>
-      </w:r>
-      <w:r>
-        <w:rPr/>
-        <w:t xml:space="preserve"> the participant-specific day allocations.</w:t>
+        <w:t>The following table presents the participant-specific day allocations.</w:t>
       </w:r>
     </w:p>
     <w:tbl>
@@ -6107,35 +6123,13 @@
           <w:ilvl w:val="0"/>
           <w:numId w:val="1"/>
         </w:numPr>
+        <w:spacing w:before="0" w:after="200"/>
+        <w:contextualSpacing/>
         <w:rPr/>
       </w:pPr>
       <w:r>
         <w:rPr/>
         <w:t>2028, year-end (stated in exchange plan): presenting final results and concluding activities (online).</w:t>
-      </w:r>
-    </w:p>
-    <w:p>
-      <w:pPr>
-        <w:pStyle w:val="Heading1"/>
-        <w:rPr/>
-      </w:pPr>
-      <w:r>
-        <w:rPr/>
-        <w:t>5. Points requiring confirmation</w:t>
-      </w:r>
-    </w:p>
-    <w:p>
-      <w:pPr>
-        <w:pStyle w:val="Normal"/>
-        <w:widowControl/>
-        <w:bidi w:val="0"/>
-        <w:spacing w:lineRule="auto" w:line="276" w:before="0" w:after="200"/>
-        <w:jc w:val="left"/>
-        <w:rPr/>
-      </w:pPr>
-      <w:r>
-        <w:rPr/>
-        <w:t>The 2027 BiH → Austria narrative says four researchers will visit for five working days, whereas the individual allocations list three days per person. This document uses the individual allocations (3 × 4 = 12 person-days) pending confirmation. In 2028, two Austria → BiH visits are described, but the allocations are 10 days for M. Wustinger and 5 days for G. Raidl; the exact assignment of researchers to each visit is not specified. Also, the exchange plan includes M. Predojević, who is not among the six researchers listed in the previously supplied project-task document. The team roster should be reconciled before submission.</w:t>
       </w:r>
     </w:p>
     <w:sectPr>

</xml_diff>